<commit_message>
Update resume links to PDF and lowercase GitHub URLs
</commit_message>
<xml_diff>
--- a/assets/resume/Jesse_Coggins_Resume.docx
+++ b/assets/resume/Jesse_Coggins_Resume.docx
@@ -61,25 +61,7 @@
           <w:sz w:val="18"/>
           <w:szCs w:val="18"/>
         </w:rPr>
-        <w:t xml:space="preserve">(256) 295-7289</w:t>
-      </w:r>
-      <w:r>
-        <w:rPr>
-          <w:rFonts w:ascii="Arial" w:cs="Arial" w:eastAsia="Arial" w:hAnsi="Arial"/>
-          <w:color w:val="4a4a4a"/>
-          <w:sz w:val="18"/>
-          <w:szCs w:val="18"/>
-        </w:rPr>
-        <w:t xml:space="preserve">   ·   jessecoggins21@gmail.com</w:t>
-      </w:r>
-      <w:r>
-        <w:rPr>
-          <w:rFonts w:ascii="Arial" w:cs="Arial" w:eastAsia="Arial" w:hAnsi="Arial"/>
-          <w:color w:val="4a4a4a"/>
-          <w:sz w:val="18"/>
-          <w:szCs w:val="18"/>
-        </w:rPr>
-        <w:t xml:space="preserve">   ·   Remote / Gadsden, AL</w:t>
+        <w:t>(256) 295-7289   ·   jessecoggins21@gmail.com   ·   Remote / Gadsden, AL</w:t>
       </w:r>
     </w:p>
     <w:p>
@@ -115,7 +97,7 @@
             <w:sz w:val="18"/>
             <w:szCs w:val="18"/>
           </w:rPr>
-          <w:t xml:space="preserve">github.com/jesse-coggins</w:t>
+          <w:t xml:space="preserve">github.com/jessecoggins</w:t>
         </w:r>
       </w:hyperlink>
       <w:r>
@@ -135,7 +117,7 @@
             <w:sz w:val="18"/>
             <w:szCs w:val="18"/>
           </w:rPr>
-          <w:t xml:space="preserve">jesse-coggins.github.io</w:t>
+          <w:t xml:space="preserve">jessecoggins.github.io</w:t>
         </w:r>
       </w:hyperlink>
     </w:p>

</xml_diff>